<commit_message>
SC rising-cost-of-living citizen-v2.1: brief reworked around the FINAL proposal grid — each proposal section opens with the grid's reported frequency/consensus/concerns (labeled process input) followed by the record facts addressed to them; record unchanged. Child care assistance record scan added for the reported legislator-discussion topic: 17-bill childcare theme (3 regulation acts; S946 45-0/105-0 died in conference; every assistance design — stipends, employer/worker credits, refundable credit filed Aug 2026 — died in the money committees without a vote; voucher/4K machinery runs through provisos). Front brief re-verified 2pp in both renders (FK 11.4); all vote pairs and 261 cited bill ids re-verified; final-grid provenance caveat flagged for human review
Co-authored-by: CaptainWrechols <CaptainWrechols@users.noreply.github.com>
</commit_message>
<xml_diff>
--- a/briefs/south-carolina/rising-cost-of-living/citizen-v2/citizen-brief.docx
+++ b/briefs/south-carolina/rising-cost-of-living/citizen-v2/citizen-brief.docx
@@ -54,7 +54,7 @@
           <w:color w:val="444444"/>
           <w:sz w:val="20"/>
         </w:rPr>
-        <w:t>The legislative record behind South Carolinians' four cost-of-living proposals, 2019–2026.</w:t>
+        <w:t>The legislative record behind the final proposal grid's cost-of-living proposals, 2019–2026.</w:t>
       </w:r>
     </w:p>
     <w:p>
@@ -86,7 +86,7 @@
           <w:color w:val="444444"/>
           <w:sz w:val="20"/>
         </w:rPr>
-        <w:t>Housing, utility bills, and taxes are the squeeze South Carolinians named in the Phase 2 conversations, and the General Assembly has been busy on all three. Across the last four two-year sessions (2019–2026), lawmakers took up 240 cost-of-living bills in this set, and 28 became law. The record splits in two. What passes is either a narrow, near-unanimous fix — a property tax break for disabled veterans, a lease escape for domestic-violence survivors — or a big negotiated package, like the Santee Cooper reform of 2021 and the income tax cuts of 2022 and 2026. What almost never passes is a structural change filed on its own: opening the electricity market, raising the homestead exemption, protecting customers on utility bills. Five of every six bills in this set died in their first committee, where South Carolina records no vote counts at all.</w:t>
+        <w:t>Housing, utility bills, and taxes are the squeeze South Carolinians named in the Community Conversations, and the General Assembly has been busy on all three. Across the last four two-year sessions (2019–2026), lawmakers took up 257 cost-of-living bills in this set, and 31 became law. The record splits in two. What passes is either a narrow, near-unanimous fix — a property tax break for disabled veterans, background checks for childcare staff — or a big negotiated package, like the Santee Cooper reform of 2021 and the income tax cuts of 2022 and 2026. What almost never passes is a structural change filed on its own: opening the electricity market, raising the homestead exemption, direct help with utility or childcare bills. Four of every five bills here died in their first committee, where South Carolina records no vote counts at all.</w:t>
       </w:r>
     </w:p>
     <w:p>
@@ -170,7 +170,7 @@
           <w:color w:val="444444"/>
           <w:sz w:val="20"/>
         </w:rPr>
-        <w:t xml:space="preserve"> — the first class that must earn the personal finance credit the 2022 state budget ordered into the graduation rules</w:t>
+        <w:t xml:space="preserve"> — the first class that must earn the personal finance credit the 2022 budget ordered into the graduation rules</w:t>
       </w:r>
     </w:p>
     <w:tbl>
@@ -213,7 +213,7 @@
                 <w:color w:val="1A2D4F"/>
                 <w:sz w:val="36"/>
               </w:rPr>
-              <w:t>240</w:t>
+              <w:t>257</w:t>
             </w:r>
           </w:p>
           <w:p>
@@ -258,7 +258,7 @@
                 <w:color w:val="1A2D4F"/>
                 <w:sz w:val="36"/>
               </w:rPr>
-              <w:t>28</w:t>
+              <w:t>31</w:t>
             </w:r>
           </w:p>
           <w:p>
@@ -317,7 +317,7 @@
                 <w:color w:val="666666"/>
                 <w:sz w:val="20"/>
               </w:rPr>
-              <w:t>bills to raise the senior homestead exemption or exempt homes entirely — one passed a chamber (S768, 44–0), none became law</w:t>
+              <w:t>bills to raise the senior homestead exemption — one passed a chamber (S768, 44–0), none became law</w:t>
             </w:r>
           </w:p>
         </w:tc>
@@ -358,7 +358,7 @@
           <w:color w:val="444444"/>
           <w:sz w:val="20"/>
         </w:rPr>
-        <w:t>Some of the biggest cost-of-living moves never appear in a stand-alone law. They live in provisos — one-year policy rules enacted inside the annual budget bill. This year's budget (FY 2026-27) gives qualifying seniors and disabled homeowners an extra $25,000 homestead exemption on top of the standing $50,000, with the state repaying local governments (proviso 117.220). It also puts the income tax cut into effect faster than the tax law's own triggers (proviso 117.191, as proviso 117.208 did last year). The citizens' financial-education idea became real this way too: FY 2022-23 proviso 1.101 ordered the half-credit personal finance graduation requirement into regulation after the bill version died. Even the Public Service Commission's funding to oversee Santee Cooper sits in a proviso (72.3). Votes on provisos are votes on the whole budget bill, never on one proviso alone.</w:t>
+        <w:t>Some of the biggest cost-of-living moves never appear in a stand-alone law. They live in provisos — one-year policy rules enacted inside the annual budget bill. This year's budget (FY 2026-27) gives qualifying seniors and disabled homeowners an extra $25,000 homestead exemption on top of the standing $50,000, with the state repaying local governments (proviso 117.220), and puts the income tax cut into effect faster than the tax law's own triggers (proviso 117.191). The financial-education idea became real this way too: FY 2022-23 proviso 1.101 ordered the half-credit personal finance graduation requirement into regulation after the bill version died. Childcare help runs the same way — the voucher program and Full-Day 4K are governed by provisos every year. Votes on provisos are votes on the whole budget bill, never on one proviso alone.</w:t>
       </w:r>
     </w:p>
     <w:p>
@@ -374,7 +374,7 @@
           <w:sz w:val="25"/>
           <w:spacing w:val="20"/>
         </w:rPr>
-        <w:t>OFTEN MOVED BEFORE: OVERSIGHT MACHINERY AND NARROW TAX FIXES</w:t>
+        <w:t>UTILITY RATES AND UTILITY POWER [P-UTILITY-TRANSPARENCY]</w:t>
       </w:r>
     </w:p>
     <w:p>
@@ -390,7 +390,7 @@
           <w:color w:val="1A2D4F"/>
           <w:sz w:val="20"/>
         </w:rPr>
-        <w:t>Watching the utilities [P-utility-transparency].</w:t>
+        <w:t>What the conversations reported:</w:t>
       </w:r>
       <w:r>
         <w:rPr>
@@ -399,7 +399,41 @@
           <w:color w:val="444444"/>
           <w:sz w:val="20"/>
         </w:rPr>
-        <w:t xml:space="preserve"> After the V.C. Summer nuclear collapse, oversight packages kept becoming law. Act 90 of 2021 (H3194) rebuilt Santee Cooper's board and, for the first time, put its rates under Public Service Commission review — House 89–26, Senate 44–1. Acts 74 and 75 of 2025 (S271, H4402) restarted the PSC elections that had been on hold, 40–0 and 110–0. The 2025 Energy Security Act (H3309, Act 41) let customers speak as public witnesses in rate cases and set schedules for rate proceedings, 94–11 and 38–3. S51 (Act 73 of 2025) told Santee Cooper to take proposals for finishing the abandoned reactors, 43–0 and 111–0.</w:t>
+        <w:t xml:space="preserve"> raised at two of four in-person events, with high agreement when discussed. The through-line: consumers feel the utility company has all the power. </w:t>
+      </w:r>
+      <w:r>
+        <w:rPr>
+          <w:rFonts w:ascii="Arial" w:hAnsi="Arial" w:cs="Arial" w:eastAsia="Arial"/>
+          <w:b/>
+          <w:color w:val="1A2D4F"/>
+          <w:sz w:val="20"/>
+        </w:rPr>
+        <w:t>What the record shows:</w:t>
+      </w:r>
+      <w:r>
+        <w:rPr>
+          <w:rFonts w:ascii="Arial" w:hAnsi="Arial" w:cs="Arial" w:eastAsia="Arial"/>
+          <w:b w:val="0"/>
+          <w:color w:val="444444"/>
+          <w:sz w:val="20"/>
+        </w:rPr>
+        <w:t xml:space="preserve"> the House has agreed four times. The 2019 Ratepayer Protection Act (H4260) banned utilities from giving campaign contributions, meals, or anything of value to the legislators' panel that screens utility regulators. It also protected utility whistleblowers and tightened regulator conflict-of-interest rules. It passed the House 105–1 and died in Senate Judiciary without a vote. So did the revolving-door ban (H4776, 101–0) and the whistleblower refiles (H4149, 118–0; H3614, 114–0). What did become law is oversight machinery. Act 90 of 2021 (H3194) put Santee Cooper's rates under Public Service Commission review for the first time. Acts 74 and 75 of 2025 restarted the stalled PSC elections. The 2025 Energy Security Act (Act 41, 94–11 and 38–3) lets customers speak as public witnesses in rate cases. On the financial-ties half: legislators already file annual Statements of Economic Interests, but those are not utility-specific. No bill adds a utility-specific disclosure duty — every filed approach regulated the utilities' side instead.</w:t>
+      </w:r>
+    </w:p>
+    <w:p>
+      <w:pPr>
+        <w:widowControl/>
+        <w:spacing w:before="84" w:after="36" w:lineRule="auto" w:line="254"/>
+      </w:pPr>
+      <w:r>
+        <w:rPr>
+          <w:rFonts w:ascii="Arial" w:hAnsi="Arial" w:cs="Arial" w:eastAsia="Arial"/>
+          <w:b/>
+          <w:color w:val="C0392B"/>
+          <w:sz w:val="25"/>
+          <w:spacing w:val="20"/>
+        </w:rPr>
+        <w:t>OPENING THE UTILITY MARKET [P-UTILITY-COMPETITION]</w:t>
       </w:r>
     </w:p>
     <w:p>
@@ -415,7 +449,7 @@
           <w:color w:val="1A2D4F"/>
           <w:sz w:val="20"/>
         </w:rPr>
-        <w:t>Narrow property tax fixes [P-reduce-property-vehicle-taxes].</w:t>
+        <w:t>What the conversations reported:</w:t>
       </w:r>
       <w:r>
         <w:rPr>
@@ -424,7 +458,25 @@
           <w:color w:val="444444"/>
           <w:sz w:val="20"/>
         </w:rPr>
-        <w:t xml:space="preserve"> Small, specific relief passes almost unanimously: disabled veterans get their exemption the year disability occurs (H3116, Act 116 of 2024, 111–0 and 45–0); a home keeps its 4% rate and exemptions while an estate settles (H3841, Act 140 of 2026, 107–0 and 43–0); surviving spouses and heirs' property qualify for the homestead exemption (S233, Act 236 of 2022). The one structural win: the Municipal Tax Relief Act (S866, Act 228 of 2026, 32–9 and 96–16) lets certain cities ask voters to swap up to a 1% sales tax for property tax credits on homes.</w:t>
+        <w:t xml:space="preserve"> raised at two of four events, with mixed agreement. Some supported the idea that a free market could lower prices. Others worried it was impractical, given the infrastructure it takes to run a utility. </w:t>
+      </w:r>
+      <w:r>
+        <w:rPr>
+          <w:rFonts w:ascii="Arial" w:hAnsi="Arial" w:cs="Arial" w:eastAsia="Arial"/>
+          <w:b/>
+          <w:color w:val="1A2D4F"/>
+          <w:sz w:val="20"/>
+        </w:rPr>
+        <w:t>What the record shows:</w:t>
+      </w:r>
+      <w:r>
+        <w:rPr>
+          <w:rFonts w:ascii="Arial" w:hAnsi="Arial" w:cs="Arial" w:eastAsia="Arial"/>
+          <w:b w:val="0"/>
+          <w:color w:val="444444"/>
+          <w:sz w:val="20"/>
+        </w:rPr>
+        <w:t xml:space="preserve"> that feasibility worry is the exact question the state once ordered studied. Act 187 of 2020 (H4940) created the Electricity Market Reform Measures Study Committee, with an independent expert consultant, on the most contested vote of any enacted bill here (House 81–31). But every bill that would actually let customers choose a supplier — retail choice (H5439), third-party suppliers (H5440, S878), co-op wholesale market access (H5525) — was filed in 2026 and died in its first committee without a vote. The closest market-structure floor fight was S12 (2025), letting Santee Cooper co-own plants with private utilities. It passed second reading 25–18, then was shelved back to committee.</w:t>
       </w:r>
     </w:p>
     <w:p>
@@ -440,7 +492,7 @@
           <w:sz w:val="25"/>
           <w:spacing w:val="20"/>
         </w:rPr>
-        <w:t>GOT SUPPORT BUT DIDN'T FINISH</w:t>
+        <w:t>PERSONAL BUDGETING AND FINANCIAL EDUCATION [P-FINANCIAL-EDUCATION]</w:t>
       </w:r>
     </w:p>
     <w:p>
@@ -456,7 +508,7 @@
           <w:color w:val="1A2D4F"/>
           <w:sz w:val="20"/>
         </w:rPr>
-        <w:t>The transparency bills the House keeps passing [P-utility-transparency].</w:t>
+        <w:t>What the conversations reported:</w:t>
       </w:r>
       <w:r>
         <w:rPr>
@@ -465,7 +517,25 @@
           <w:color w:val="444444"/>
           <w:sz w:val="20"/>
         </w:rPr>
-        <w:t xml:space="preserve"> The 2019 Ratepayer Protection Act (H4260) went straight at the citizens' concern: it banned utilities from giving campaign contributions, meals, or anything of value to the legislators' panel that screens utility regulators, protected utility whistleblowers, and tightened regulator conflict-of-interest rules. It passed the House 105–1 and died in Senate Judiciary without a vote. The revolving-door ban (H4776) passed the House 101–0 — same ending. The whistleblower refiles passed 118–0 (H4149, 2022) and 114–0 (H3614, 2023) — same committee, same ending, four times in eight years. A homestead exemption increase finally passed a chamber in 2026 (S768: $100,000 and age 60, Senate 44–0) and died in House Ways and Means [P-reduce-property-vehicle-taxes]. The 2024 energy package (H5118) passed both chambers, 88–21 and 40–2, and died in conference — its successor became the 2025 law.</w:t>
+        <w:t xml:space="preserve"> raised at one event (Columbia), with mixed agreement. Participants agreed financial skills matter. They split over how to teach them, whether it is the state's role, and how a program would be implemented. </w:t>
+      </w:r>
+      <w:r>
+        <w:rPr>
+          <w:rFonts w:ascii="Arial" w:hAnsi="Arial" w:cs="Arial" w:eastAsia="Arial"/>
+          <w:b/>
+          <w:color w:val="1A2D4F"/>
+          <w:sz w:val="20"/>
+        </w:rPr>
+        <w:t>What the record shows:</w:t>
+      </w:r>
+      <w:r>
+        <w:rPr>
+          <w:rFonts w:ascii="Arial" w:hAnsi="Arial" w:cs="Arial" w:eastAsia="Arial"/>
+          <w:b w:val="0"/>
+          <w:color w:val="444444"/>
+          <w:sz w:val="20"/>
+        </w:rPr>
+        <w:t xml:space="preserve"> the implementation question has an answer on the books. Schools have been required to offer financial-literacy instruction since 2005 (Section 59-29-410). The graduation requirement became policy through the budget after six bills fell short. S16 passed the Senate 44–1 and the House 109–0 in differing versions and died in conference in 2022; that same year, budget proviso 1.101 ordered the requirement into regulation. Regulation 43-234 took effect in May 2023. Every student entering ninth grade from fall 2023 (the Class of 2027 first) must earn a half-credit in personal finance to graduate. No bill on the topic has been filed since. Nothing in the record addresses financial education for adults.</w:t>
       </w:r>
     </w:p>
     <w:p>
@@ -481,7 +551,7 @@
           <w:sz w:val="25"/>
           <w:spacing w:val="20"/>
         </w:rPr>
-        <w:t>RARELY MOVED BEFORE</w:t>
+        <w:t>REDUCE OR ELIMINATE PROPERTY AND VEHICLE TAXES [P-REDUCE-PROPERTY-VEHICLE-TAXES]</w:t>
       </w:r>
     </w:p>
     <w:p>
@@ -497,7 +567,7 @@
           <w:color w:val="1A2D4F"/>
           <w:sz w:val="20"/>
         </w:rPr>
-        <w:t>Opening the electricity market [P-utility-competition].</w:t>
+        <w:t>From the grid's legislator-feedback section</w:t>
       </w:r>
       <w:r>
         <w:rPr>
@@ -506,7 +576,41 @@
           <w:color w:val="444444"/>
           <w:sz w:val="20"/>
         </w:rPr>
-        <w:t xml:space="preserve"> The state officially studied it: Act 187 of 2020 (H4940) created the Electricity Market Reform Measures Study Committee, with an independent expert consultant — House 81–31, the most contested vote of any enacted bill here. But every bill that would actually let customers choose a power supplier — retail choice (H5439), third-party suppliers (H5440, S878), co-op wholesale market access (H5525) — was filed in 2026 and died in its first committee without a vote. So did all 19 utility customer-billing bills in this set (shutoff limits, payment-fee bans, balance-transfer bans): not one recorded vote in eight years.</w:t>
+        <w:t xml:space="preserve"> (no Phase 2 frequency or consensus cells). The flagged tradeoff is replacing the revenue, since schools and local government run on property taxes. </w:t>
+      </w:r>
+      <w:r>
+        <w:rPr>
+          <w:rFonts w:ascii="Arial" w:hAnsi="Arial" w:cs="Arial" w:eastAsia="Arial"/>
+          <w:b/>
+          <w:color w:val="1A2D4F"/>
+          <w:sz w:val="20"/>
+        </w:rPr>
+        <w:t>What the record shows:</w:t>
+      </w:r>
+      <w:r>
+        <w:rPr>
+          <w:rFonts w:ascii="Arial" w:hAnsi="Arial" w:cs="Arial" w:eastAsia="Arial"/>
+          <w:b w:val="0"/>
+          <w:color w:val="444444"/>
+          <w:sz w:val="20"/>
+        </w:rPr>
+        <w:t xml:space="preserve"> the most-filed lane — 80 bills — with the narrowest wins. Full elimination was filed once (H3378, 2025: every property tax, with dollar-for-dollar state repayment). It died in House Ways and Means, where 45 of the 67 home-property-tax bills stopped. Thirty-five homestead-exemption increases died the same way — except S768 (2026: $100,000 and age 60), which passed the Senate 44–0 and then died there too. Thirteen vehicle and boat tax bills produced zero recorded votes; none proposes ending the vehicle tax statewide. What passed is targeted and near-unanimous — disabled veterans (Act 116 of 2024), estates (Act 140 of 2026) — plus one structural option. The Municipal Tax Relief Act (S866, Act 228 of 2026, 32–9 and 96–16) lets certain cities swap a voter-approved sales tax for home property tax credits — it answers the revenue tradeoff by swapping the source. Owner-occupied homes already pay no school operating taxes (a statewide sales-tax penny repays schools). And the biggest recent relief is one-year budget relief: the extra $25,000 homestead exemption (proviso 117.220).</w:t>
+      </w:r>
+    </w:p>
+    <w:p>
+      <w:pPr>
+        <w:widowControl/>
+        <w:spacing w:before="84" w:after="36" w:lineRule="auto" w:line="254"/>
+      </w:pPr>
+      <w:r>
+        <w:rPr>
+          <w:rFonts w:ascii="Arial" w:hAnsi="Arial" w:cs="Arial" w:eastAsia="Arial"/>
+          <w:b/>
+          <w:color w:val="C0392B"/>
+          <w:sz w:val="25"/>
+          <w:spacing w:val="20"/>
+        </w:rPr>
+        <w:t>RAISED WITH LEGISLATORS: CHILD CARE ASSISTANCE</w:t>
       </w:r>
     </w:p>
     <w:p>
@@ -522,7 +626,7 @@
           <w:color w:val="1A2D4F"/>
           <w:sz w:val="20"/>
         </w:rPr>
-        <w:t>Cutting property and vehicle taxes broadly [P-reduce-property-vehicle-taxes].</w:t>
+        <w:t>Not a Phase 2 proposal</w:t>
       </w:r>
       <w:r>
         <w:rPr>
@@ -531,48 +635,7 @@
           <w:color w:val="444444"/>
           <w:sz w:val="20"/>
         </w:rPr>
-        <w:t xml:space="preserve"> Full elimination was filed once — H3378 (2025) would have ended every property tax with dollar-for-dollar state repayment to local governments — and died in House Ways and Means, where 45 of the 67 home-property-tax bills in this set stopped. Thirteen vehicle and boat tax bills produced zero recorded votes; the broadest, H5014 (2026), would have exempted one car for seniors. No bill in this record proposes ending the vehicle property tax statewide.</w:t>
-      </w:r>
-    </w:p>
-    <w:p>
-      <w:pPr>
-        <w:widowControl/>
-        <w:spacing w:before="84" w:after="36" w:lineRule="auto" w:line="254"/>
-      </w:pPr>
-      <w:r>
-        <w:rPr>
-          <w:rFonts w:ascii="Arial" w:hAnsi="Arial" w:cs="Arial" w:eastAsia="Arial"/>
-          <w:b/>
-          <w:color w:val="C0392B"/>
-          <w:sz w:val="25"/>
-          <w:spacing w:val="20"/>
-        </w:rPr>
-        <w:t>ALREADY POLICY — THROUGH THE BUDGET, NOT A BILL</w:t>
-      </w:r>
-    </w:p>
-    <w:p>
-      <w:pPr>
-        <w:widowControl/>
-        <w:spacing w:before="0" w:after="49" w:lineRule="auto" w:line="247"/>
-        <w:jc w:val="both"/>
-      </w:pPr>
-      <w:r>
-        <w:rPr>
-          <w:rFonts w:ascii="Arial" w:hAnsi="Arial" w:cs="Arial" w:eastAsia="Arial"/>
-          <w:b/>
-          <w:color w:val="1A2D4F"/>
-          <w:sz w:val="20"/>
-        </w:rPr>
-        <w:t>Personal finance in school [P-financial-education].</w:t>
-      </w:r>
-      <w:r>
-        <w:rPr>
-          <w:rFonts w:ascii="Arial" w:hAnsi="Arial" w:cs="Arial" w:eastAsia="Arial"/>
-          <w:b w:val="0"/>
-          <w:color w:val="444444"/>
-          <w:sz w:val="20"/>
-        </w:rPr>
-        <w:t xml:space="preserve"> Six bills tried to make personal finance a graduation requirement. H3199 passed the House 102–10 and died in Senate Education; S16 passed the Senate 44–1 and the House 109–0 in differing versions and died in conference in 2022. That same year, budget proviso 1.101 ordered the State Board of Education to write the requirement into regulation — and it took effect in May 2023. Students who started ninth grade in 2023-24 (the Class of 2027) must earn a half-credit in personal finance to graduate. No bill on the topic has been filed since. Nothing in the record addresses financial education for adults.</w:t>
+        <w:t xml:space="preserve"> — sitting legislators have discussed the possibility of some form of childcare assistance, so the record was scanned. What passes in childcare is regulation, never assistance: background checks (Act 52 of 2019), First Steps governance (Act 81 of 2023), caregiver training (Act 216 of 2024). The 2024 modernization bill (S946) passed the Senate 45–0 and the House 105–0 before dying in conference. Every assistance design has died in a money committee without a vote: childcare stipends for unemployed parents (H4394), a bigger employer childcare credit plus a pay-supplement credit for childcare workers (S47/H4015), and a refundable child-and-dependent-care credit (H5794 — filed August 2026, the newest bill in this set). Filings are accelerating. Every design runs through the tax code — the venue where this record's cost relief actually passes. Today's assistance is federal voucher money run through DSS under one-year budget provisos; no direct-payment state subsidy has ever been filed.</w:t>
       </w:r>
     </w:p>
     <w:p>
@@ -604,7 +667,7 @@
           <w:color w:val="444444"/>
           <w:sz w:val="20"/>
         </w:rPr>
-        <w:t>Four rooms decide this issue. Utility bills go to House Labor, Commerce and Industry and to Senate Judiciary — in South Carolina, utility law belongs to the Judiciary Committee — and tax bills go to House Ways and Means and Senate Finance. Of 240 bills, 200 never left their first committee, and no committee vote counts exist because the state does not publish them. Rep. King led fourteen bills — utility billing protections and senior exemptions — all stopped in first committee. Rep. Jones led twelve 2025-26 housing bills; same result. Rep. Ott carried the whistleblower bills the House passed 118–0 and 114–0. The enacted packages were carried by chamber leaders: Speaker Lucas (Santee Cooper reform), Rep. G.M. Smith (the energy bills), Sen. Peeler (the 2022 tax cut and S768). The genuinely contested votes are few: the market-reform study (81–31), Santee Cooper joint ownership (S12, 25–18 on second reading, later shelved), the 2026 income tax cut (64–47 in the House), and the municipal sales-tax swap (32–9).</w:t>
+        <w:t>Four rooms decide this issue. Utility bills go to House Labor, Commerce and Industry and to Senate Judiciary — in South Carolina, utility law belongs to the Judiciary Committee. Tax bills, including every childcare-assistance design, go to House Ways and Means and Senate Finance. Of 257 bills, 201 died in their first committee, and no committee vote counts exist because the state does not publish them. Rep. King led fourteen bills — utility billing protections and senior exemptions — all stopped in first committee. Rep. Ott carried the whistleblower bills the House passed 118–0 and 114–0. The enacted packages were carried by chamber leaders: Speaker Lucas (Santee Cooper reform), Rep. G.M. Smith (the energy bills), Sen. Peeler (the 2022 tax cut and S768). The contested votes are few: the market-reform study (81–31), Santee Cooper joint ownership (25–18), the 2026 income tax cut (64–47), and the sales-tax swap (32–9).</w:t>
       </w:r>
     </w:p>
     <w:p>
@@ -636,7 +699,7 @@
           <w:color w:val="444444"/>
           <w:sz w:val="20"/>
         </w:rPr>
-        <w:t>The 126th session was the biggest enacting session in this record: the Energy Security Act (Act 41), restarted PSC elections (Acts 74/75), the V.C. Summer proposals resolution (Act 73), the income tax restructuring to a 5.21% top rate (H4216, Act 110 of 2026, 64–47 and 39–5), the municipal sales-tax swap (Act 228), estate continuity for home tax status (Act 140), a higher manufacturing-exemption reimbursement cap (Act 122), and the domestic-violence lease release (Act 184). The FY 2026-27 budget added the extra $25,000 homestead exemption, the accelerated tax rate, and a new state program building affordable starter homes (proviso 42.7, "Made it Home!").</w:t>
+        <w:t>The 126th was the biggest enacting session in this record: the Energy Security Act (Act 41), restarted PSC elections (Acts 74/75), the income tax restructuring to a 5.21% top rate (Act 110 of 2026), the municipal sales-tax swap (Act 228), and the domestic-violence lease release (Act 184) — plus the budget's extra homestead exemption and "Made it Home!" starter-home program.</w:t>
       </w:r>
     </w:p>
     <w:p>
@@ -684,7 +747,7 @@
           <w:color w:val="1A2D4F"/>
           <w:sz w:val="20"/>
         </w:rPr>
-        <w:t>The House keeps passing the accountability bills; Senate Judiciary keeps not taking them up.</w:t>
+        <w:t>Reported in the grid:</w:t>
       </w:r>
       <w:r>
         <w:rPr>
@@ -693,7 +756,25 @@
           <w:color w:val="444444"/>
           <w:sz w:val="20"/>
         </w:rPr>
-        <w:t xml:space="preserve"> The exact citizen concern — money flowing between utilities and the officials who oversee them — was the 2019 Ratepayer Protection Act (H4260): no utility campaign contributions, meals, lodging, or anything of value for members of the Public Utilities Review Committee, the legislative panel that screens PSC candidates; whistleblower protections for utility employees; conflict-of-interest rules for regulators. House 105–1, died in Senate Judiciary. H4776 (2019) would have stretched the ban on regulators going to work for utilities from one year to three — House 101–0, same ending. The whistleblower core passed the House alone twice more: H4149 (2022) 118–0 and H3614 (2023) 114–0, dying in Senate Judiciary both times. What did become law is oversight structure: Santee Cooper's rates now go through PSC review (Act 90 of 2021), PSC elections restarted after years of expired terms (Acts 74/75 of 2025), and customers can now testify as public witnesses in rate cases (Act 41 of 2025). On disclosure: legislators already file annual Statements of Economic Interests under the ethics law, but those forms are not utility-specific, and no bill in this record adds a utility-specific disclosure duty — every filed approach regulated the utilities' side instead.</w:t>
+        <w:t xml:space="preserve"> medium frequency (two of four in-person events); high consensus when discussed; the through-line was that consumers feel the utility company has all the power. </w:t>
+      </w:r>
+      <w:r>
+        <w:rPr>
+          <w:rFonts w:ascii="Arial" w:hAnsi="Arial" w:cs="Arial" w:eastAsia="Arial"/>
+          <w:b/>
+          <w:color w:val="1A2D4F"/>
+          <w:sz w:val="20"/>
+        </w:rPr>
+        <w:t>The record, point by point:</w:t>
+      </w:r>
+      <w:r>
+        <w:rPr>
+          <w:rFonts w:ascii="Arial" w:hAnsi="Arial" w:cs="Arial" w:eastAsia="Arial"/>
+          <w:b w:val="0"/>
+          <w:color w:val="444444"/>
+          <w:sz w:val="20"/>
+        </w:rPr>
+        <w:t xml:space="preserve"> the power imbalance is what the enacted oversight wave addressed — Santee Cooper's rates now go through PSC review (Act 90 of 2021), PSC elections restarted after years of expired terms (Acts 74/75 of 2025), and customers can now testify as public witnesses in rate cases with testimony deadlines the utility must meet (Act 41 of 2025). The unfinished half is accountability around the regulators themselves: the 2019 Ratepayer Protection Act (H4260) — no utility campaign contributions, meals, lodging, or anything of value for members of the Public Utilities Review Committee, whistleblower protections, conflict-of-interest rules — passed the House 105–1 and died in Senate Judiciary, and its narrower refiles repeated that path 101–0 (H4776), 118–0 (H4149), and 114–0 (H3614). On disclosure specifically, the grid's legislator note says members already report on their Statements of Economic Interests; the record adds that those annual ethics filings are public but not utility-specific, and that no bill from 2019–2026 proposes a utility-specific disclosure duty for legislators — the filed approach regulated what utilities may give, not what legislators must disclose.</w:t>
       </w:r>
     </w:p>
     <w:p>
@@ -725,7 +806,7 @@
           <w:color w:val="1A2D4F"/>
           <w:sz w:val="20"/>
         </w:rPr>
-        <w:t>One enacted study, zero bills with a vote.</w:t>
+        <w:t>Reported in the grid:</w:t>
       </w:r>
       <w:r>
         <w:rPr>
@@ -734,7 +815,25 @@
           <w:color w:val="444444"/>
           <w:sz w:val="20"/>
         </w:rPr>
-        <w:t xml:space="preserve"> Act 187 of 2020 (H4940) created the Electricity Market Reform Measures Study Committee to examine market reforms with an independent consultant; it passed the House 81–31 and the Senate 41–0. The bills that would actually end the monopoly arrived only in 2026, after two years of rate debates, and all died in their first committee without a vote: H5439 (retail choice for households and small businesses, with PSC permits and price disclosures), H5440 and S878 (third-party suppliers over the incumbent's wires, with the customer paying transmission costs), and H5525 (PSC oversight of the electric co-ops' wholesale power contracts). Earlier edges of the idea went the same way: letting businesses buy from a supplier outside their assigned territory (H3344, 2019) and forcing Santee Cooper to sell its plants and join a regional grid operator (S439, 2021). The closest the Senate came to a market-structure floor fight was S12 (2025) — letting Santee Cooper co-own plants with private utilities — which passed second reading 25–18 and was then shelved back to committee. The citizens' own flagged tradeoff, whether the grid can support competition, is exactly what the 2020 study was created to examine; its report sits outside this bill record.</w:t>
+        <w:t xml:space="preserve"> medium frequency (two of four events); mixed consensus — some believed a free market could lower prices, others questioned feasibility given the infrastructure it takes to run a utility; the legislator note calls the idea a non-starter. </w:t>
+      </w:r>
+      <w:r>
+        <w:rPr>
+          <w:rFonts w:ascii="Arial" w:hAnsi="Arial" w:cs="Arial" w:eastAsia="Arial"/>
+          <w:b/>
+          <w:color w:val="1A2D4F"/>
+          <w:sz w:val="20"/>
+        </w:rPr>
+        <w:t>The record, point by point:</w:t>
+      </w:r>
+      <w:r>
+        <w:rPr>
+          <w:rFonts w:ascii="Arial" w:hAnsi="Arial" w:cs="Arial" w:eastAsia="Arial"/>
+          <w:b w:val="0"/>
+          <w:color w:val="444444"/>
+          <w:sz w:val="20"/>
+        </w:rPr>
+        <w:t xml:space="preserve"> the feasibility worry is the question Act 187 of 2020 (H4940) created the Electricity Market Reform Measures Study Committee to answer, with an independent expert consultant — House 81–31, Senate 41–0; the committee's report sits outside this bill record. The bills that would actually open the market all arrived in 2026, after two years of rate debates, and none received a vote: H5439 (retail choice for households and small businesses, with PSC permits and plain-language price disclosures), H5440 and S878 (third-party suppliers over the incumbent's wires, with the customer paying transmission costs — designs that work within the existing infrastructure rather than duplicating it), and H5525 (PSC oversight of the co-ops' wholesale power contracts). Earlier edges went the same way: territory choice for businesses (H3344, 2019) and forcing Santee Cooper to join a regional grid operator (S439, 2021). The one market-structure floor vote is S12 (2025) — Santee Cooper co-owning plants with private utilities — 25–18 on second reading, then shelved.</w:t>
       </w:r>
     </w:p>
     <w:p>
@@ -766,7 +865,7 @@
           <w:color w:val="1A2D4F"/>
           <w:sz w:val="20"/>
         </w:rPr>
-        <w:t>The proposal that already happened — through the budget and a regulation.</w:t>
+        <w:t>Reported in the grid:</w:t>
       </w:r>
       <w:r>
         <w:rPr>
@@ -775,7 +874,25 @@
           <w:color w:val="444444"/>
           <w:sz w:val="20"/>
         </w:rPr>
-        <w:t xml:space="preserve"> South Carolina law has required schools to offer financial-literacy instruction since 2005 (Section 59-29-410); bills in 2019 and 2021 to add topics like student loans and credit passed one chamber at most (H3199: House 102–10, died in Senate Education). The graduation-requirement push came closest as S16 (2021-22), which passed the Senate 44–1 and the House 109–0 in differing versions and died in conference. Then the budget finished it: FY 2022-23 proviso 1.101 directed the State Board of Education to write a required half-credit in personal finance into the graduation regulation. Regulation 43-234 (Document 5130) took effect May 26, 2023. Every student who entered ninth grade from fall 2023 on — starting with the Class of 2027 — must earn the credit. The approval resolution for the regulation (S732) stalled in committee, but under the state's regulation-review law the requirement took effect anyway. Since then, no personal-finance bill has been filed. The record contains nothing on financial education for adults, and the Community Conversations' own caution stands: education does not lower prices.</w:t>
+        <w:t xml:space="preserve"> low frequency (Columbia); mixed consensus — agreement that financial responsibility matters, divergence on how to accomplish it; concerns about implementation and whether it is the state's responsibility; the legislator note asks for "a specific action," such as a subject taught in schools. </w:t>
+      </w:r>
+      <w:r>
+        <w:rPr>
+          <w:rFonts w:ascii="Arial" w:hAnsi="Arial" w:cs="Arial" w:eastAsia="Arial"/>
+          <w:b/>
+          <w:color w:val="1A2D4F"/>
+          <w:sz w:val="20"/>
+        </w:rPr>
+        <w:t>The record, point by point:</w:t>
+      </w:r>
+      <w:r>
+        <w:rPr>
+          <w:rFonts w:ascii="Arial" w:hAnsi="Arial" w:cs="Arial" w:eastAsia="Arial"/>
+          <w:b w:val="0"/>
+          <w:color w:val="444444"/>
+          <w:sz w:val="20"/>
+        </w:rPr>
+        <w:t xml:space="preserve"> the specific action the note asks for already happened. The state claimed the role in 2005 (Section 59-29-410, required financial-literacy instruction offerings), and the school-subject version became binding through the budget: after S16 passed the Senate 44–1 and the House 109–0 in differing versions and died in conference (2022), FY 2022-23 proviso 1.101 directed the State Board of Education to write a required half-credit in personal finance into the graduation regulation. Regulation 43-234 (Document 5130) took effect May 26, 2023; every student entering ninth grade from fall 2023 — the Class of 2027 first — must earn the credit. The approval resolution (S732) stalled in committee, but under the state's regulation-review law the requirement took effect anyway. The implementation questions participants raised remain live in one sense: the first bound class has not yet graduated, so no outcome data exists, and no bill has ever addressed financial education for adults.</w:t>
       </w:r>
     </w:p>
     <w:p>
@@ -807,7 +924,7 @@
           <w:color w:val="1A2D4F"/>
           <w:sz w:val="20"/>
         </w:rPr>
-        <w:t>Eighty bills, the narrowest wins — and the biggest recent relief came through the budget.</w:t>
+        <w:t>From the grid's legislator-feedback section;</w:t>
       </w:r>
       <w:r>
         <w:rPr>
@@ -816,7 +933,84 @@
           <w:color w:val="444444"/>
           <w:sz w:val="20"/>
         </w:rPr>
-        <w:t xml:space="preserve"> Full elimination was filed once: H3378 (2025) would have ended all property taxes with dollar-for-dollar state repayment to local governments; it died in House Ways and Means without a vote. Thirty-five bills to raise the $50,000 senior/disabled homestead exemption — to $75,000 (S910), $100,000 (H3127, S768), the home's full value (H3687, H4197), or new groups (deaf taxpayers, S1027/S433) — died the same way, except S768 (2026), which passed the Senate 44–0 and then died in House Ways and Means. On vehicles: thirteen bills, zero votes, none statewide — the broadest (H5014, 2026) would have exempted one car per senior. What became law is targeted: disabled veterans (Act 116 of 2024), surviving spouses and heirs' property (Act 236 of 2022), estates (Act 140 of 2026), installment payments (Act 69 of 2021), plus the S866 sales-tax-swap option for cities (Act 228 of 2026). The budget did the rest: this year's proviso 117.220 adds an extra $25,000 homestead exemption, and provisos 117.208/117.191 accelerated the income tax cut. Context for the tradeoff citizens flagged: since 2006, owner-occupied homes already pay no school operating taxes — a statewide sales-tax penny repays the schools — so broader cuts turn on what replaces the rest of local revenue.</w:t>
+        <w:t xml:space="preserve"> the standing tradeoff is what replaces the revenue that schools and local governments collect. </w:t>
+      </w:r>
+      <w:r>
+        <w:rPr>
+          <w:rFonts w:ascii="Arial" w:hAnsi="Arial" w:cs="Arial" w:eastAsia="Arial"/>
+          <w:b/>
+          <w:color w:val="1A2D4F"/>
+          <w:sz w:val="20"/>
+        </w:rPr>
+        <w:t>The record, point by point:</w:t>
+      </w:r>
+      <w:r>
+        <w:rPr>
+          <w:rFonts w:ascii="Arial" w:hAnsi="Arial" w:cs="Arial" w:eastAsia="Arial"/>
+          <w:b w:val="0"/>
+          <w:color w:val="444444"/>
+          <w:sz w:val="20"/>
+        </w:rPr>
+        <w:t xml:space="preserve"> eighty bills, the narrowest wins, and the budget doing the heaviest recent lifting. Full elimination was filed once: H3378 (2025) would have ended all property taxes with dollar-for-dollar state repayment to local governments; it died in House Ways and Means without a vote. Thirty-five bills to raise the $50,000 senior/disabled homestead exemption — to $75,000 (S910), $100,000 (H3127, S768), the home's full value (H3687, H4197), or new groups (deaf taxpayers, S1027/S433) — died the same way, except S768 (2026), which passed the Senate 44–0 and then died in House Ways and Means. On vehicles: thirteen bills, zero votes, none statewide — the broadest (H5014, 2026) would have exempted one car per senior. What became law is targeted: disabled veterans (Act 116 of 2024), surviving spouses and heirs' property (Act 236 of 2022), estates (Act 140 of 2026), installment payments (Act 69 of 2021), plus the S866 sales-tax-swap option for cities (Act 228 of 2026) — the one enacted design that answers the revenue tradeoff directly, by replacing property tax with a voter-approved sales tax. The budget did the rest: proviso 117.220 adds an extra $25,000 homestead exemption this year, and provisos 117.208/117.191 accelerated the income tax cut. Since 2006, owner-occupied homes already pay no school operating taxes — a statewide sales-tax penny repays the schools — so elimination designs concern the remaining county, municipal, and bond lines, plus vehicles.</w:t>
+      </w:r>
+    </w:p>
+    <w:p>
+      <w:pPr>
+        <w:widowControl/>
+        <w:spacing w:before="84" w:after="36" w:lineRule="auto" w:line="254"/>
+      </w:pPr>
+      <w:r>
+        <w:rPr>
+          <w:rFonts w:ascii="Arial" w:hAnsi="Arial" w:cs="Arial" w:eastAsia="Arial"/>
+          <w:b/>
+          <w:color w:val="C0392B"/>
+          <w:sz w:val="25"/>
+          <w:spacing w:val="20"/>
+        </w:rPr>
+        <w:t>CHILD CARE ASSISTANCE (LEGISLATOR-DISCUSSION TOPIC)</w:t>
+      </w:r>
+    </w:p>
+    <w:p>
+      <w:pPr>
+        <w:widowControl/>
+        <w:spacing w:before="0" w:after="49" w:lineRule="auto" w:line="247"/>
+        <w:jc w:val="both"/>
+      </w:pPr>
+      <w:r>
+        <w:rPr>
+          <w:rFonts w:ascii="Arial" w:hAnsi="Arial" w:cs="Arial" w:eastAsia="Arial"/>
+          <w:b/>
+          <w:color w:val="1A2D4F"/>
+          <w:sz w:val="20"/>
+        </w:rPr>
+        <w:t>Not a Phase 2 proposal:</w:t>
+      </w:r>
+      <w:r>
+        <w:rPr>
+          <w:rFonts w:ascii="Arial" w:hAnsi="Arial" w:cs="Arial" w:eastAsia="Arial"/>
+          <w:b w:val="0"/>
+          <w:color w:val="444444"/>
+          <w:sz w:val="20"/>
+        </w:rPr>
+        <w:t xml:space="preserve"> raised in reported discussions with sitting legislators; scanned on request. </w:t>
+      </w:r>
+      <w:r>
+        <w:rPr>
+          <w:rFonts w:ascii="Arial" w:hAnsi="Arial" w:cs="Arial" w:eastAsia="Arial"/>
+          <w:b/>
+          <w:color w:val="1A2D4F"/>
+          <w:sz w:val="20"/>
+        </w:rPr>
+        <w:t>The record:</w:t>
+      </w:r>
+      <w:r>
+        <w:rPr>
+          <w:rFonts w:ascii="Arial" w:hAnsi="Arial" w:cs="Arial" w:eastAsia="Arial"/>
+          <w:b w:val="0"/>
+          <w:color w:val="444444"/>
+          <w:sz w:val="20"/>
+        </w:rPr>
+        <w:t xml:space="preserve"> three childcare acts in eight years, all regulation — staff background checks (S595, Act 52 of 2019, 39–0 and 100–1), First Steps board restructuring (H4023, Act 81 of 2023, 41–0 and 107–0), caregiver training requirements (S862, Act 216 of 2024). The near-miss was also regulation: S946 (2024) passed the Senate 45–0 and the House 105–0 in differing versions and died in conference at session's end. Every assistance design died in a money committee without a vote: workforce childcare stipends for unemployed parents and caregivers (H4394, 2025); a bigger employer childcare tax credit plus a new credit for childcare directors and staff (S47/H4015, 2025); a refundable child-and-dependent-care credit (H5794, filed August 2026); the Childcare Advance Act deferral (H4993, 2024); pre-K expansion grants (H5205, 2024). One bill runs the other direction — S770 (2026) would add work requirements to federally funded childcare assistance. The machinery any design would build on already exists: two childcare tax credits in statute, the federal voucher program run through DSS under one-year budget provisos (38.17, plus a new fraud-reporting proviso 38.28 this year), and Full-Day 4K expanding through provisos every cycle. What has never been filed: a direct-payment state subsidy to families or providers outside the tax code.</w:t>
       </w:r>
     </w:p>
     <w:p>
@@ -1231,40 +1425,6 @@
           <w:color w:val="1A2D4F"/>
           <w:sz w:val="20"/>
         </w:rPr>
-        <w:t>Reassessment / 15% cap:</w:t>
-      </w:r>
-      <w:r>
-        <w:rPr>
-          <w:rFonts w:ascii="Arial" w:hAnsi="Arial" w:cs="Arial" w:eastAsia="Arial"/>
-          <w:b w:val="0"/>
-          <w:color w:val="444444"/>
-          <w:sz w:val="20"/>
-        </w:rPr>
-        <w:t xml:space="preserve"> Counties revalue property every five years; a home's taxable value may rise at most 15% per cycle. Amendments to rework this died without votes.</w:t>
-      </w:r>
-    </w:p>
-    <w:p>
-      <w:pPr>
-        <w:widowControl/>
-        <w:spacing w:before="0" w:after="60" w:lineRule="auto" w:line="252"/>
-        <w:ind w:left="200"/>
-      </w:pPr>
-      <w:r>
-        <w:rPr>
-          <w:rFonts w:ascii="Arial" w:hAnsi="Arial" w:cs="Arial" w:eastAsia="Arial"/>
-          <w:b w:val="0"/>
-          <w:color w:val="C0392B"/>
-          <w:sz w:val="20"/>
-        </w:rPr>
-        <w:t xml:space="preserve">▪  </w:t>
-      </w:r>
-      <w:r>
-        <w:rPr>
-          <w:rFonts w:ascii="Arial" w:hAnsi="Arial" w:cs="Arial" w:eastAsia="Arial"/>
-          <w:b/>
-          <w:color w:val="1A2D4F"/>
-          <w:sz w:val="20"/>
-        </w:rPr>
         <w:t>Vehicle property tax:</w:t>
       </w:r>
       <w:r>
@@ -1309,6 +1469,40 @@
           <w:sz w:val="20"/>
         </w:rPr>
         <w:t xml:space="preserve"> The 2026 law letting certain cities ask voters to approve up to a 1% sales tax that funds property tax credits on owner-occupied homes.</w:t>
+      </w:r>
+    </w:p>
+    <w:p>
+      <w:pPr>
+        <w:widowControl/>
+        <w:spacing w:before="0" w:after="60" w:lineRule="auto" w:line="252"/>
+        <w:ind w:left="200"/>
+      </w:pPr>
+      <w:r>
+        <w:rPr>
+          <w:rFonts w:ascii="Arial" w:hAnsi="Arial" w:cs="Arial" w:eastAsia="Arial"/>
+          <w:b w:val="0"/>
+          <w:color w:val="C0392B"/>
+          <w:sz w:val="20"/>
+        </w:rPr>
+        <w:t xml:space="preserve">▪  </w:t>
+      </w:r>
+      <w:r>
+        <w:rPr>
+          <w:rFonts w:ascii="Arial" w:hAnsi="Arial" w:cs="Arial" w:eastAsia="Arial"/>
+          <w:b/>
+          <w:color w:val="1A2D4F"/>
+          <w:sz w:val="20"/>
+        </w:rPr>
+        <w:t>Child care voucher / scholarship:</w:t>
+      </w:r>
+      <w:r>
+        <w:rPr>
+          <w:rFonts w:ascii="Arial" w:hAnsi="Arial" w:cs="Arial" w:eastAsia="Arial"/>
+          <w:b w:val="0"/>
+          <w:color w:val="444444"/>
+          <w:sz w:val="20"/>
+        </w:rPr>
+        <w:t xml:space="preserve"> The federally funded childcare assistance program run through DSS; the budget regulates it annually by proviso. The state's two childcare tax credits (for employers, and for child and dependent care expenses) are the machinery the filed assistance bills would extend.</w:t>
       </w:r>
     </w:p>
     <w:p>
@@ -1664,7 +1858,7 @@
           <w:color w:val="444444"/>
           <w:sz w:val="20"/>
         </w:rPr>
-        <w:t xml:space="preserve"> Negotiators from both chambers who reconcile differing versions; a bill dies there if no deal comes before session's end (S16 in 2022, H5118 in 2024).</w:t>
+        <w:t xml:space="preserve"> Negotiators from both chambers who reconcile differing versions; a bill dies there if no deal comes before session's end (S16 in 2022, H5118 in 2024, S946 in 2024).</w:t>
       </w:r>
     </w:p>
     <w:p>

</xml_diff>